<commit_message>
Mejorar diseno responsive: menu movil y tarjetas en panel admin
</commit_message>
<xml_diff>
--- a/P Cambiar correo barbero.docx
+++ b/P Cambiar correo barbero.docx
@@ -347,6 +347,7 @@
       </w:pPr>
       <w:r>
         <w:rPr>
+          <w:noProof/>
           <w:lang w:val="es-MX"/>
         </w:rPr>
         <w:drawing>
@@ -527,6 +528,7 @@
       </w:pPr>
       <w:r>
         <w:rPr>
+          <w:noProof/>
           <w:lang w:val="es-MX"/>
         </w:rPr>
         <w:lastRenderedPageBreak/>
@@ -1670,6 +1672,156 @@
           <w:lang w:val="es-MX"/>
         </w:rPr>
       </w:pPr>
+      <w:proofErr w:type="spellStart"/>
+      <w:r>
+        <w:rPr>
+          <w:lang w:val="es-MX"/>
+        </w:rPr>
+        <w:t>git</w:t>
+      </w:r>
+      <w:proofErr w:type="spellEnd"/>
+      <w:r>
+        <w:rPr>
+          <w:lang w:val="es-MX"/>
+        </w:rPr>
+        <w:t xml:space="preserve"> </w:t>
+      </w:r>
+      <w:proofErr w:type="spellStart"/>
+      <w:proofErr w:type="gramStart"/>
+      <w:r>
+        <w:rPr>
+          <w:lang w:val="es-MX"/>
+        </w:rPr>
+        <w:t>add</w:t>
+      </w:r>
+      <w:proofErr w:type="spellEnd"/>
+      <w:r>
+        <w:rPr>
+          <w:lang w:val="es-MX"/>
+        </w:rPr>
+        <w:t xml:space="preserve"> .</w:t>
+      </w:r>
+      <w:proofErr w:type="gramEnd"/>
+    </w:p>
+    <w:p>
+      <w:pPr>
+        <w:rPr>
+          <w:lang w:val="es-MX"/>
+        </w:rPr>
+      </w:pPr>
+      <w:proofErr w:type="spellStart"/>
+      <w:r>
+        <w:rPr>
+          <w:lang w:val="es-MX"/>
+        </w:rPr>
+        <w:t>git</w:t>
+      </w:r>
+      <w:proofErr w:type="spellEnd"/>
+      <w:r>
+        <w:rPr>
+          <w:lang w:val="es-MX"/>
+        </w:rPr>
+        <w:t xml:space="preserve"> </w:t>
+      </w:r>
+      <w:proofErr w:type="spellStart"/>
+      <w:r>
+        <w:rPr>
+          <w:lang w:val="es-MX"/>
+        </w:rPr>
+        <w:t>commit</w:t>
+      </w:r>
+      <w:proofErr w:type="spellEnd"/>
+      <w:r>
+        <w:rPr>
+          <w:lang w:val="es-MX"/>
+        </w:rPr>
+        <w:t xml:space="preserve"> -m "</w:t>
+      </w:r>
+      <w:proofErr w:type="spellStart"/>
+      <w:r>
+        <w:rPr>
+          <w:lang w:val="es-MX"/>
+        </w:rPr>
+        <w:t>ultimos</w:t>
+      </w:r>
+      <w:proofErr w:type="spellEnd"/>
+      <w:r>
+        <w:rPr>
+          <w:lang w:val="es-MX"/>
+        </w:rPr>
+        <w:t xml:space="preserve"> </w:t>
+      </w:r>
+      <w:proofErr w:type="spellStart"/>
+      <w:r>
+        <w:rPr>
+          <w:lang w:val="es-MX"/>
+        </w:rPr>
+        <w:t>cmabios</w:t>
+      </w:r>
+      <w:proofErr w:type="spellEnd"/>
+      <w:r>
+        <w:rPr>
+          <w:lang w:val="es-MX"/>
+        </w:rPr>
+        <w:t>"</w:t>
+      </w:r>
+    </w:p>
+    <w:p>
+      <w:pPr>
+        <w:rPr>
+          <w:lang w:val="es-MX"/>
+        </w:rPr>
+      </w:pPr>
+      <w:proofErr w:type="spellStart"/>
+      <w:r>
+        <w:rPr>
+          <w:lang w:val="es-MX"/>
+        </w:rPr>
+        <w:t>git</w:t>
+      </w:r>
+      <w:proofErr w:type="spellEnd"/>
+      <w:r>
+        <w:rPr>
+          <w:lang w:val="es-MX"/>
+        </w:rPr>
+        <w:t xml:space="preserve"> </w:t>
+      </w:r>
+      <w:proofErr w:type="spellStart"/>
+      <w:r>
+        <w:rPr>
+          <w:lang w:val="es-MX"/>
+        </w:rPr>
+        <w:t>push</w:t>
+      </w:r>
+      <w:proofErr w:type="spellEnd"/>
+      <w:r>
+        <w:rPr>
+          <w:lang w:val="es-MX"/>
+        </w:rPr>
+        <w:t xml:space="preserve"> </w:t>
+      </w:r>
+      <w:proofErr w:type="spellStart"/>
+      <w:r>
+        <w:rPr>
+          <w:lang w:val="es-MX"/>
+        </w:rPr>
+        <w:t>origin</w:t>
+      </w:r>
+      <w:proofErr w:type="spellEnd"/>
+      <w:r>
+        <w:rPr>
+          <w:lang w:val="es-MX"/>
+        </w:rPr>
+        <w:t xml:space="preserve"> </w:t>
+      </w:r>
+      <w:proofErr w:type="spellStart"/>
+      <w:r>
+        <w:rPr>
+          <w:lang w:val="es-MX"/>
+        </w:rPr>
+        <w:t>main</w:t>
+      </w:r>
+      <w:proofErr w:type="spellEnd"/>
     </w:p>
     <w:sectPr>
       <w:pgSz w:w="11906" w:h="16838"/>

</xml_diff>